<commit_message>
Updating plots with new variables
</commit_message>
<xml_diff>
--- a/raw/documentation/variable_grouping_Documentation.docx
+++ b/raw/documentation/variable_grouping_Documentation.docx
@@ -243,31 +243,7 @@
         <w:rPr>
           <w:rFonts w:cstheme="minorHAnsi"/>
         </w:rPr>
-        <w:t>Notes: Date of birth has been recoded into actual age in AGE.</w:t>
-      </w:r>
-      <w:r>
-        <w:rPr>
-          <w:rFonts w:cstheme="minorHAnsi"/>
-        </w:rPr>
-        <w:t xml:space="preserve"> </w:t>
-      </w:r>
-      <w:r>
-        <w:rPr>
-          <w:rFonts w:cstheme="minorHAnsi"/>
-        </w:rPr>
-        <w:t>The response categories have been collapsed for convenience of</w:t>
-      </w:r>
-      <w:r>
-        <w:rPr>
-          <w:rFonts w:cstheme="minorHAnsi"/>
-        </w:rPr>
-        <w:t xml:space="preserve"> </w:t>
-      </w:r>
-      <w:r>
-        <w:rPr>
-          <w:rFonts w:cstheme="minorHAnsi"/>
-        </w:rPr>
-        <w:t>display.</w:t>
+        <w:t>Notes: Date of birth has been recoded into actual age in AGE. The response categories have been collapsed for convenience of display.</w:t>
       </w:r>
     </w:p>
     <w:p>
@@ -503,19 +479,7 @@
         <w:rPr>
           <w:rFonts w:cstheme="minorHAnsi"/>
         </w:rPr>
-        <w:t>(What is your race? Indicate one or more races that you consider yourself to be.)</w:t>
-      </w:r>
-      <w:r>
-        <w:rPr>
-          <w:rFonts w:cstheme="minorHAnsi"/>
-        </w:rPr>
-        <w:t xml:space="preserve"> </w:t>
-      </w:r>
-      <w:r>
-        <w:rPr>
-          <w:rFonts w:cstheme="minorHAnsi"/>
-        </w:rPr>
-        <w:t>First mention</w:t>
+        <w:t>(What is your race? Indicate one or more races that you consider yourself to be.) First mention</w:t>
       </w:r>
     </w:p>
     <w:p>
@@ -739,79 +703,7 @@
         <w:rPr>
           <w:rFonts w:cstheme="minorHAnsi"/>
         </w:rPr>
-        <w:t>Notes:</w:t>
-      </w:r>
-      <w:r>
-        <w:rPr>
-          <w:rFonts w:cstheme="minorHAnsi"/>
-        </w:rPr>
-        <w:t xml:space="preserve"> </w:t>
-      </w:r>
-      <w:r>
-        <w:rPr>
-          <w:rFonts w:cstheme="minorHAnsi"/>
-        </w:rPr>
-        <w:t>DEGREE is recoded from a series of questions which can be found in</w:t>
-      </w:r>
-      <w:r>
-        <w:rPr>
-          <w:rFonts w:cstheme="minorHAnsi"/>
-        </w:rPr>
-        <w:t xml:space="preserve"> </w:t>
-      </w:r>
-      <w:r>
-        <w:rPr>
-          <w:rFonts w:cstheme="minorHAnsi"/>
-        </w:rPr>
-        <w:t>the GSS Questionnaire.</w:t>
-      </w:r>
-      <w:r>
-        <w:rPr>
-          <w:rFonts w:cstheme="minorHAnsi"/>
-        </w:rPr>
-        <w:t xml:space="preserve"> </w:t>
-      </w:r>
-      <w:r>
-        <w:rPr>
-          <w:rFonts w:cstheme="minorHAnsi"/>
-        </w:rPr>
-        <w:t>Unweighted percentages for DEGREE in the 2021 data reflect</w:t>
-      </w:r>
-      <w:r>
-        <w:rPr>
-          <w:rFonts w:cstheme="minorHAnsi"/>
-        </w:rPr>
-        <w:t xml:space="preserve"> </w:t>
-      </w:r>
-      <w:r>
-        <w:rPr>
-          <w:rFonts w:cstheme="minorHAnsi"/>
-        </w:rPr>
-        <w:t>methodological</w:t>
-      </w:r>
-      <w:r>
-        <w:rPr>
-          <w:rFonts w:cstheme="minorHAnsi"/>
-        </w:rPr>
-        <w:t xml:space="preserve"> c</w:t>
-      </w:r>
-      <w:r>
-        <w:rPr>
-          <w:rFonts w:cstheme="minorHAnsi"/>
-        </w:rPr>
-        <w:t>hanges due to the COVID-19 pandemic,</w:t>
-      </w:r>
-      <w:r>
-        <w:rPr>
-          <w:rFonts w:cstheme="minorHAnsi"/>
-        </w:rPr>
-        <w:t xml:space="preserve"> </w:t>
-      </w:r>
-      <w:r>
-        <w:rPr>
-          <w:rFonts w:cstheme="minorHAnsi"/>
-        </w:rPr>
-        <w:t>when compared to earlier rounds of the GSS.</w:t>
+        <w:t>Notes: DEGREE is recoded from a series of questions which can be found in the GSS Questionnaire. Unweighted percentages for DEGREE in the 2021 data reflect methodological changes due to the COVID-19 pandemic, when compared to earlier rounds of the GSS.</w:t>
       </w:r>
     </w:p>
     <w:p>
@@ -911,19 +803,7 @@
         <w:rPr>
           <w:rFonts w:cstheme="minorHAnsi"/>
         </w:rPr>
-        <w:t>Label: Family income in 1972-2006 surveys in constant dollars</w:t>
-      </w:r>
-      <w:r>
-        <w:rPr>
-          <w:rFonts w:cstheme="minorHAnsi"/>
-        </w:rPr>
-        <w:t xml:space="preserve"> </w:t>
-      </w:r>
-      <w:r>
-        <w:rPr>
-          <w:rFonts w:cstheme="minorHAnsi"/>
-        </w:rPr>
-        <w:t>(base=1986)</w:t>
+        <w:t>Label: Family income in 1972-2006 surveys in constant dollars (base=1986)</w:t>
       </w:r>
     </w:p>
     <w:p>
@@ -1080,19 +960,7 @@
         <w:rPr>
           <w:rFonts w:cstheme="minorHAnsi"/>
         </w:rPr>
-        <w:t>Label: Are you currently married, widowed, divorced,</w:t>
-      </w:r>
-      <w:r>
-        <w:rPr>
-          <w:rFonts w:cstheme="minorHAnsi"/>
-        </w:rPr>
-        <w:t xml:space="preserve"> </w:t>
-      </w:r>
-      <w:r>
-        <w:rPr>
-          <w:rFonts w:cstheme="minorHAnsi"/>
-        </w:rPr>
-        <w:t>separated, or have you never been married?</w:t>
+        <w:t>Label: Are you currently married, widowed, divorced, separated, or have you never been married?</w:t>
       </w:r>
     </w:p>
     <w:p>
@@ -1316,19 +1184,7 @@
         <w:rPr>
           <w:rFonts w:cstheme="minorHAnsi"/>
         </w:rPr>
-        <w:t>Label: How often do you attend religious services?</w:t>
-      </w:r>
-      <w:r>
-        <w:rPr>
-          <w:rFonts w:cstheme="minorHAnsi"/>
-        </w:rPr>
-        <w:t xml:space="preserve"> </w:t>
-      </w:r>
-      <w:r>
-        <w:rPr>
-          <w:rFonts w:cstheme="minorHAnsi"/>
-        </w:rPr>
-        <w:t>(USE CATEGORIES AS PROBES, IF NECESSARY.)</w:t>
+        <w:t>Label: How often do you attend religious services? (USE CATEGORIES AS PROBES, IF NECESSARY.)</w:t>
       </w:r>
     </w:p>
     <w:p>
@@ -1440,19 +1296,7 @@
         <w:rPr>
           <w:rFonts w:cstheme="minorHAnsi"/>
         </w:rPr>
-        <w:t>Label: Generally speaking, do you usually think of yourself as a Republican,</w:t>
-      </w:r>
-      <w:r>
-        <w:rPr>
-          <w:rFonts w:cstheme="minorHAnsi"/>
-        </w:rPr>
-        <w:t xml:space="preserve"> </w:t>
-      </w:r>
-      <w:r>
-        <w:rPr>
-          <w:rFonts w:cstheme="minorHAnsi"/>
-        </w:rPr>
-        <w:t>Democrat, Independent, or what?</w:t>
+        <w:t>Label: Generally speaking, do you usually think of yourself as a Republican, Democrat, Independent, or what?</w:t>
       </w:r>
     </w:p>
     <w:p>
@@ -1572,243 +1416,354 @@
           <w:szCs w:val="21"/>
           <w:u w:val="single"/>
         </w:rPr>
-        <w:t>XNORCSIZ</w:t>
-      </w:r>
-      <w:r>
+        <w:t>XNORCSIZ – page 170)</w:t>
+      </w:r>
+    </w:p>
+    <w:p>
+      <w:pPr>
+        <w:rPr>
+          <w:rFonts w:cstheme="minorHAnsi"/>
+        </w:rPr>
+      </w:pPr>
+      <w:r>
+        <w:rPr>
+          <w:rFonts w:cstheme="minorHAnsi"/>
+        </w:rPr>
+        <w:t>Label: NORC SIZE OF PLACE</w:t>
+      </w:r>
+    </w:p>
+    <w:p>
+      <w:pPr>
+        <w:pStyle w:val="ListParagraph"/>
+        <w:numPr>
+          <w:ilvl w:val="0"/>
+          <w:numId w:val="1"/>
+        </w:numPr>
+        <w:rPr>
+          <w:rFonts w:cstheme="minorHAnsi"/>
+        </w:rPr>
+      </w:pPr>
+      <w:r>
+        <w:rPr>
+          <w:rFonts w:cstheme="minorHAnsi"/>
+        </w:rPr>
+        <w:t>Big City = 1, 2</w:t>
+      </w:r>
+    </w:p>
+    <w:p>
+      <w:pPr>
+        <w:pStyle w:val="ListParagraph"/>
+        <w:numPr>
+          <w:ilvl w:val="0"/>
+          <w:numId w:val="1"/>
+        </w:numPr>
+        <w:rPr>
+          <w:rFonts w:cstheme="minorHAnsi"/>
+        </w:rPr>
+      </w:pPr>
+      <w:r>
+        <w:rPr>
+          <w:rFonts w:cstheme="minorHAnsi"/>
+        </w:rPr>
+        <w:t>Suburb = 3, 4, 5, 6</w:t>
+      </w:r>
+    </w:p>
+    <w:p>
+      <w:pPr>
+        <w:pStyle w:val="ListParagraph"/>
+        <w:numPr>
+          <w:ilvl w:val="0"/>
+          <w:numId w:val="1"/>
+        </w:numPr>
+        <w:rPr>
+          <w:rFonts w:cstheme="minorHAnsi"/>
+        </w:rPr>
+      </w:pPr>
+      <w:r>
+        <w:rPr>
+          <w:rFonts w:cstheme="minorHAnsi"/>
+        </w:rPr>
+        <w:t>Small/rural town = 7, 8, 9, 10</w:t>
+      </w:r>
+    </w:p>
+    <w:p>
+      <w:pPr>
+        <w:rPr>
+          <w:rFonts w:cstheme="minorHAnsi"/>
+        </w:rPr>
+      </w:pPr>
+    </w:p>
+    <w:p>
+      <w:pPr>
+        <w:rPr>
+          <w:rFonts w:cstheme="minorHAnsi"/>
+          <w:u w:val="single"/>
+        </w:rPr>
+      </w:pPr>
+      <w:r>
+        <w:rPr>
+          <w:rFonts w:cstheme="minorHAnsi"/>
+          <w:u w:val="single"/>
+        </w:rPr>
+        <w:t>Health (</w:t>
+      </w:r>
+      <w:r>
+        <w:rPr>
+          <w:rFonts w:cstheme="minorHAnsi"/>
+          <w:u w:val="single"/>
+        </w:rPr>
+        <w:t>HEALTH –</w:t>
+      </w:r>
+      <w:r>
+        <w:rPr>
+          <w:rFonts w:cstheme="minorHAnsi"/>
+          <w:u w:val="single"/>
+        </w:rPr>
+        <w:t xml:space="preserve"> page</w:t>
+      </w:r>
+      <w:r>
+        <w:rPr>
+          <w:rFonts w:cstheme="minorHAnsi"/>
+          <w:u w:val="single"/>
+        </w:rPr>
+        <w:t xml:space="preserve"> 214)</w:t>
+      </w:r>
+    </w:p>
+    <w:p>
+      <w:pPr>
+        <w:autoSpaceDE w:val="0"/>
+        <w:autoSpaceDN w:val="0"/>
+        <w:adjustRightInd w:val="0"/>
+        <w:spacing w:after="0" w:line="240" w:lineRule="auto"/>
+        <w:rPr>
+          <w:rFonts w:cstheme="minorHAnsi"/>
+        </w:rPr>
+      </w:pPr>
+      <w:r>
+        <w:rPr>
+          <w:rFonts w:cstheme="minorHAnsi"/>
+        </w:rPr>
+        <w:t>Label: Would you say your own health, in general, is excellent, good, fair, or poor?</w:t>
+      </w:r>
+    </w:p>
+    <w:p>
+      <w:pPr>
+        <w:pStyle w:val="ListParagraph"/>
+        <w:numPr>
+          <w:ilvl w:val="0"/>
+          <w:numId w:val="1"/>
+        </w:numPr>
+        <w:rPr>
+          <w:rFonts w:cstheme="minorHAnsi"/>
+        </w:rPr>
+      </w:pPr>
+      <w:r>
+        <w:rPr>
+          <w:rFonts w:cstheme="minorHAnsi"/>
+        </w:rPr>
+        <w:t>Good = 1, 2</w:t>
+      </w:r>
+    </w:p>
+    <w:p>
+      <w:pPr>
+        <w:pStyle w:val="ListParagraph"/>
+        <w:numPr>
+          <w:ilvl w:val="0"/>
+          <w:numId w:val="1"/>
+        </w:numPr>
+        <w:rPr>
+          <w:rFonts w:cstheme="minorHAnsi"/>
+        </w:rPr>
+      </w:pPr>
+      <w:r>
+        <w:rPr>
+          <w:rFonts w:cstheme="minorHAnsi"/>
+        </w:rPr>
+        <w:t>Fair = 3</w:t>
+      </w:r>
+    </w:p>
+    <w:p>
+      <w:pPr>
+        <w:pStyle w:val="ListParagraph"/>
+        <w:numPr>
+          <w:ilvl w:val="0"/>
+          <w:numId w:val="1"/>
+        </w:numPr>
+        <w:rPr>
+          <w:rFonts w:cstheme="minorHAnsi"/>
+        </w:rPr>
+      </w:pPr>
+      <w:r>
+        <w:rPr>
+          <w:rFonts w:cstheme="minorHAnsi"/>
+        </w:rPr>
+        <w:t>Poor = 4</w:t>
+      </w:r>
+    </w:p>
+    <w:p>
+      <w:pPr>
+        <w:rPr>
+          <w:rFonts w:cstheme="minorHAnsi"/>
+        </w:rPr>
+      </w:pPr>
+    </w:p>
+    <w:p>
+      <w:pPr>
+        <w:spacing w:line="285" w:lineRule="atLeast"/>
         <w:rPr>
           <w:rFonts w:eastAsia="Times New Roman" w:cstheme="minorHAnsi"/>
           <w:sz w:val="21"/>
           <w:szCs w:val="21"/>
           <w:u w:val="single"/>
         </w:rPr>
-        <w:t xml:space="preserve"> – page 170)</w:t>
-      </w:r>
-    </w:p>
-    <w:p>
-      <w:pPr>
-        <w:rPr>
-          <w:rFonts w:cstheme="minorHAnsi"/>
-        </w:rPr>
-      </w:pPr>
-      <w:r>
-        <w:rPr>
-          <w:rFonts w:cstheme="minorHAnsi"/>
-        </w:rPr>
-        <w:t>Label: NORC SIZE OF PLACE</w:t>
-      </w:r>
-    </w:p>
-    <w:p>
-      <w:pPr>
-        <w:pStyle w:val="ListParagraph"/>
-        <w:numPr>
-          <w:ilvl w:val="0"/>
-          <w:numId w:val="1"/>
-        </w:numPr>
-        <w:rPr>
-          <w:rFonts w:cstheme="minorHAnsi"/>
-        </w:rPr>
-      </w:pPr>
-      <w:r>
-        <w:rPr>
-          <w:rFonts w:cstheme="minorHAnsi"/>
-        </w:rPr>
-        <w:t>Big City = 1, 2</w:t>
-      </w:r>
-    </w:p>
-    <w:p>
-      <w:pPr>
-        <w:pStyle w:val="ListParagraph"/>
-        <w:numPr>
-          <w:ilvl w:val="0"/>
-          <w:numId w:val="1"/>
-        </w:numPr>
-        <w:rPr>
-          <w:rFonts w:cstheme="minorHAnsi"/>
-        </w:rPr>
-      </w:pPr>
-      <w:r>
-        <w:rPr>
-          <w:rFonts w:cstheme="minorHAnsi"/>
-        </w:rPr>
-        <w:t>Suburb = 3, 4, 5, 6</w:t>
-      </w:r>
-    </w:p>
-    <w:p>
-      <w:pPr>
-        <w:pStyle w:val="ListParagraph"/>
-        <w:numPr>
-          <w:ilvl w:val="0"/>
-          <w:numId w:val="1"/>
-        </w:numPr>
-        <w:rPr>
-          <w:rFonts w:cstheme="minorHAnsi"/>
-        </w:rPr>
-      </w:pPr>
-      <w:r>
-        <w:rPr>
-          <w:rFonts w:cstheme="minorHAnsi"/>
-        </w:rPr>
-        <w:t>Small/rural town = 7, 8, 9, 10</w:t>
-      </w:r>
-    </w:p>
-    <w:p>
-      <w:pPr>
-        <w:rPr>
-          <w:rFonts w:cstheme="minorHAnsi"/>
-        </w:rPr>
-      </w:pPr>
-    </w:p>
-    <w:p>
-      <w:pPr>
-        <w:rPr>
-          <w:rFonts w:cstheme="minorHAnsi"/>
-          <w:u w:val="single"/>
-        </w:rPr>
-      </w:pPr>
-      <w:r>
-        <w:rPr>
-          <w:rFonts w:cstheme="minorHAnsi"/>
-          <w:u w:val="single"/>
-        </w:rPr>
-        <w:t>Health (</w:t>
-      </w:r>
-      <w:r>
-        <w:rPr>
-          <w:rFonts w:cstheme="minorHAnsi"/>
-          <w:u w:val="single"/>
-        </w:rPr>
-        <w:t>HEALTH –</w:t>
-      </w:r>
-      <w:r>
-        <w:rPr>
-          <w:rFonts w:cstheme="minorHAnsi"/>
-          <w:u w:val="single"/>
-        </w:rPr>
-        <w:t xml:space="preserve"> page</w:t>
-      </w:r>
-      <w:r>
-        <w:rPr>
-          <w:rFonts w:cstheme="minorHAnsi"/>
-          <w:u w:val="single"/>
-        </w:rPr>
-        <w:t xml:space="preserve"> 214)</w:t>
-      </w:r>
-    </w:p>
-    <w:p>
-      <w:pPr>
-        <w:autoSpaceDE w:val="0"/>
-        <w:autoSpaceDN w:val="0"/>
-        <w:adjustRightInd w:val="0"/>
-        <w:spacing w:after="0" w:line="240" w:lineRule="auto"/>
-        <w:rPr>
-          <w:rFonts w:cstheme="minorHAnsi"/>
-        </w:rPr>
-      </w:pPr>
-      <w:r>
-        <w:rPr>
-          <w:rFonts w:cstheme="minorHAnsi"/>
-        </w:rPr>
-        <w:t>Label: Would you say your own health, in general,</w:t>
-      </w:r>
-      <w:r>
-        <w:rPr>
-          <w:rFonts w:cstheme="minorHAnsi"/>
-        </w:rPr>
-        <w:t xml:space="preserve"> </w:t>
-      </w:r>
-      <w:r>
-        <w:rPr>
-          <w:rFonts w:cstheme="minorHAnsi"/>
-        </w:rPr>
-        <w:t>is excellent, good, fair, or poor?</w:t>
-      </w:r>
-    </w:p>
-    <w:p>
-      <w:pPr>
-        <w:pStyle w:val="ListParagraph"/>
-        <w:numPr>
-          <w:ilvl w:val="0"/>
-          <w:numId w:val="1"/>
-        </w:numPr>
-        <w:rPr>
-          <w:rFonts w:cstheme="minorHAnsi"/>
-        </w:rPr>
-      </w:pPr>
-      <w:r>
-        <w:rPr>
-          <w:rFonts w:cstheme="minorHAnsi"/>
-        </w:rPr>
-        <w:t>Good = 1, 2</w:t>
-      </w:r>
-    </w:p>
-    <w:p>
-      <w:pPr>
-        <w:pStyle w:val="ListParagraph"/>
-        <w:numPr>
-          <w:ilvl w:val="0"/>
-          <w:numId w:val="1"/>
-        </w:numPr>
-        <w:rPr>
-          <w:rFonts w:cstheme="minorHAnsi"/>
-        </w:rPr>
-      </w:pPr>
-      <w:r>
-        <w:rPr>
-          <w:rFonts w:cstheme="minorHAnsi"/>
-        </w:rPr>
-        <w:t>Fair = 3</w:t>
-      </w:r>
-    </w:p>
-    <w:p>
-      <w:pPr>
-        <w:pStyle w:val="ListParagraph"/>
-        <w:numPr>
-          <w:ilvl w:val="0"/>
-          <w:numId w:val="1"/>
-        </w:numPr>
-        <w:rPr>
-          <w:rFonts w:cstheme="minorHAnsi"/>
-        </w:rPr>
-      </w:pPr>
-      <w:r>
-        <w:rPr>
-          <w:rFonts w:cstheme="minorHAnsi"/>
-        </w:rPr>
-        <w:t>Poor = 4</w:t>
-      </w:r>
-    </w:p>
-    <w:p>
-      <w:pPr>
-        <w:rPr>
-          <w:rFonts w:cstheme="minorHAnsi"/>
-        </w:rPr>
-      </w:pPr>
-    </w:p>
-    <w:p>
-      <w:pPr>
-        <w:spacing w:line="285" w:lineRule="atLeast"/>
+      </w:pPr>
+      <w:r>
+        <w:rPr>
+          <w:rFonts w:cstheme="minorHAnsi"/>
+          <w:u w:val="single"/>
+        </w:rPr>
+        <w:t>Socializing (</w:t>
+      </w:r>
+      <w:r>
         <w:rPr>
           <w:rFonts w:eastAsia="Times New Roman" w:cstheme="minorHAnsi"/>
           <w:sz w:val="21"/>
           <w:szCs w:val="21"/>
           <w:u w:val="single"/>
         </w:rPr>
-      </w:pPr>
-      <w:r>
-        <w:rPr>
-          <w:rFonts w:cstheme="minorHAnsi"/>
-          <w:u w:val="single"/>
-        </w:rPr>
-        <w:t>Socializing (</w:t>
-      </w:r>
-      <w:r>
+        <w:t>SOCFREND – page 230)</w:t>
+      </w:r>
+    </w:p>
+    <w:p>
+      <w:pPr>
+        <w:autoSpaceDE w:val="0"/>
+        <w:autoSpaceDN w:val="0"/>
+        <w:adjustRightInd w:val="0"/>
+        <w:spacing w:after="0" w:line="240" w:lineRule="auto"/>
+        <w:rPr>
+          <w:rFonts w:cstheme="minorHAnsi"/>
+        </w:rPr>
+      </w:pPr>
+      <w:r>
+        <w:rPr>
+          <w:rFonts w:cstheme="minorHAnsi"/>
+        </w:rPr>
+        <w:t>Label: (For each of the next four questions, please select the answer that comes closest to how often you do the following things…) Spend a social evening with friends who live outside the neighborhood?</w:t>
+      </w:r>
+    </w:p>
+    <w:p>
+      <w:pPr>
+        <w:autoSpaceDE w:val="0"/>
+        <w:autoSpaceDN w:val="0"/>
+        <w:adjustRightInd w:val="0"/>
+        <w:spacing w:after="0" w:line="240" w:lineRule="auto"/>
+        <w:rPr>
+          <w:rFonts w:cstheme="minorHAnsi"/>
+          <w:b/>
+          <w:bCs/>
+        </w:rPr>
+      </w:pPr>
+    </w:p>
+    <w:p>
+      <w:pPr>
+        <w:pStyle w:val="ListParagraph"/>
+        <w:numPr>
+          <w:ilvl w:val="0"/>
+          <w:numId w:val="1"/>
+        </w:numPr>
+        <w:autoSpaceDE w:val="0"/>
+        <w:autoSpaceDN w:val="0"/>
+        <w:adjustRightInd w:val="0"/>
+        <w:spacing w:after="0" w:line="240" w:lineRule="auto"/>
+        <w:rPr>
+          <w:rFonts w:cstheme="minorHAnsi"/>
+        </w:rPr>
+      </w:pPr>
+      <w:r>
+        <w:rPr>
+          <w:rFonts w:cstheme="minorHAnsi"/>
+        </w:rPr>
+        <w:t>Weekly or more = 1, 2, 3</w:t>
+      </w:r>
+    </w:p>
+    <w:p>
+      <w:pPr>
+        <w:pStyle w:val="ListParagraph"/>
+        <w:numPr>
+          <w:ilvl w:val="0"/>
+          <w:numId w:val="1"/>
+        </w:numPr>
+        <w:autoSpaceDE w:val="0"/>
+        <w:autoSpaceDN w:val="0"/>
+        <w:adjustRightInd w:val="0"/>
+        <w:spacing w:after="0" w:line="240" w:lineRule="auto"/>
+        <w:rPr>
+          <w:rFonts w:cstheme="minorHAnsi"/>
+        </w:rPr>
+      </w:pPr>
+      <w:r>
+        <w:rPr>
+          <w:rFonts w:cstheme="minorHAnsi"/>
+        </w:rPr>
+        <w:t>Sometimes = 4, 5, 6</w:t>
+      </w:r>
+    </w:p>
+    <w:p>
+      <w:pPr>
+        <w:pStyle w:val="ListParagraph"/>
+        <w:numPr>
+          <w:ilvl w:val="0"/>
+          <w:numId w:val="1"/>
+        </w:numPr>
+        <w:autoSpaceDE w:val="0"/>
+        <w:autoSpaceDN w:val="0"/>
+        <w:adjustRightInd w:val="0"/>
+        <w:spacing w:after="0" w:line="240" w:lineRule="auto"/>
+        <w:rPr>
+          <w:rFonts w:cstheme="minorHAnsi"/>
+        </w:rPr>
+      </w:pPr>
+      <w:r>
+        <w:rPr>
+          <w:rFonts w:cstheme="minorHAnsi"/>
+        </w:rPr>
+        <w:t>Never = 7</w:t>
+      </w:r>
+    </w:p>
+    <w:p>
+      <w:pPr>
+        <w:autoSpaceDE w:val="0"/>
+        <w:autoSpaceDN w:val="0"/>
+        <w:adjustRightInd w:val="0"/>
+        <w:spacing w:after="0" w:line="240" w:lineRule="auto"/>
+        <w:rPr>
+          <w:rFonts w:cstheme="minorHAnsi"/>
+        </w:rPr>
+      </w:pPr>
+    </w:p>
+    <w:p>
+      <w:pPr>
+        <w:spacing w:line="285" w:lineRule="atLeast"/>
         <w:rPr>
           <w:rFonts w:eastAsia="Times New Roman" w:cstheme="minorHAnsi"/>
           <w:sz w:val="21"/>
           <w:szCs w:val="21"/>
           <w:u w:val="single"/>
         </w:rPr>
-        <w:t>SOCFREND</w:t>
+      </w:pPr>
+      <w:r>
+        <w:rPr>
+          <w:rFonts w:cstheme="minorHAnsi"/>
+          <w:u w:val="single"/>
+        </w:rPr>
+        <w:t>Own/Rent</w:t>
+      </w:r>
+      <w:r>
+        <w:rPr>
+          <w:rFonts w:cstheme="minorHAnsi"/>
+          <w:u w:val="single"/>
+        </w:rPr>
+        <w:t xml:space="preserve"> (</w:t>
       </w:r>
       <w:r>
         <w:rPr>
@@ -1817,84 +1772,24 @@
           <w:szCs w:val="21"/>
           <w:u w:val="single"/>
         </w:rPr>
-        <w:t xml:space="preserve"> – page 230)</w:t>
-      </w:r>
-    </w:p>
-    <w:p>
-      <w:pPr>
-        <w:autoSpaceDE w:val="0"/>
-        <w:autoSpaceDN w:val="0"/>
-        <w:adjustRightInd w:val="0"/>
-        <w:spacing w:after="0" w:line="240" w:lineRule="auto"/>
-        <w:rPr>
-          <w:rFonts w:cstheme="minorHAnsi"/>
-        </w:rPr>
-      </w:pPr>
-      <w:r>
-        <w:rPr>
-          <w:rFonts w:cstheme="minorHAnsi"/>
-        </w:rPr>
-        <w:t>Label:</w:t>
-      </w:r>
-      <w:r>
-        <w:rPr>
-          <w:rFonts w:cstheme="minorHAnsi"/>
-        </w:rPr>
-        <w:t xml:space="preserve"> </w:t>
-      </w:r>
-      <w:r>
-        <w:rPr>
-          <w:rFonts w:cstheme="minorHAnsi"/>
-        </w:rPr>
-        <w:t>(For each of the next four questions,</w:t>
-      </w:r>
-      <w:r>
-        <w:rPr>
-          <w:rFonts w:cstheme="minorHAnsi"/>
-        </w:rPr>
-        <w:t xml:space="preserve"> </w:t>
-      </w:r>
-      <w:r>
-        <w:rPr>
-          <w:rFonts w:cstheme="minorHAnsi"/>
-        </w:rPr>
-        <w:t>please select the answer that comes closest to how often you do the</w:t>
-      </w:r>
-      <w:r>
-        <w:rPr>
-          <w:rFonts w:cstheme="minorHAnsi"/>
-        </w:rPr>
-        <w:t xml:space="preserve"> </w:t>
-      </w:r>
-      <w:r>
-        <w:rPr>
-          <w:rFonts w:cstheme="minorHAnsi"/>
-        </w:rPr>
-        <w:t>following things…)</w:t>
-      </w:r>
-      <w:r>
-        <w:rPr>
-          <w:rFonts w:cstheme="minorHAnsi"/>
-        </w:rPr>
-        <w:t xml:space="preserve"> </w:t>
-      </w:r>
-      <w:r>
-        <w:rPr>
-          <w:rFonts w:cstheme="minorHAnsi"/>
-        </w:rPr>
-        <w:t>Spend a social evening with friends who live outside the</w:t>
-      </w:r>
-      <w:r>
-        <w:rPr>
-          <w:rFonts w:cstheme="minorHAnsi"/>
-        </w:rPr>
-        <w:t xml:space="preserve"> </w:t>
-      </w:r>
-      <w:r>
-        <w:rPr>
-          <w:rFonts w:cstheme="minorHAnsi"/>
-        </w:rPr>
-        <w:t>neighborhood?</w:t>
+        <w:t>DWELOWN – page 321)</w:t>
+      </w:r>
+    </w:p>
+    <w:p>
+      <w:pPr>
+        <w:autoSpaceDE w:val="0"/>
+        <w:autoSpaceDN w:val="0"/>
+        <w:adjustRightInd w:val="0"/>
+        <w:spacing w:after="0" w:line="240" w:lineRule="auto"/>
+        <w:rPr>
+          <w:rFonts w:cstheme="minorHAnsi"/>
+        </w:rPr>
+      </w:pPr>
+      <w:r>
+        <w:rPr>
+          <w:rFonts w:cstheme="minorHAnsi"/>
+        </w:rPr>
+        <w:t>Label: (Do you/Does your family) own your (home/apartment), pay rent, or what?</w:t>
       </w:r>
     </w:p>
     <w:p>
@@ -1929,180 +1824,6 @@
         <w:rPr>
           <w:rFonts w:cstheme="minorHAnsi"/>
         </w:rPr>
-        <w:t>Weekly or more = 1, 2, 3</w:t>
-      </w:r>
-    </w:p>
-    <w:p>
-      <w:pPr>
-        <w:pStyle w:val="ListParagraph"/>
-        <w:numPr>
-          <w:ilvl w:val="0"/>
-          <w:numId w:val="1"/>
-        </w:numPr>
-        <w:autoSpaceDE w:val="0"/>
-        <w:autoSpaceDN w:val="0"/>
-        <w:adjustRightInd w:val="0"/>
-        <w:spacing w:after="0" w:line="240" w:lineRule="auto"/>
-        <w:rPr>
-          <w:rFonts w:cstheme="minorHAnsi"/>
-        </w:rPr>
-      </w:pPr>
-      <w:r>
-        <w:rPr>
-          <w:rFonts w:cstheme="minorHAnsi"/>
-        </w:rPr>
-        <w:t>Sometimes = 4, 5, 6</w:t>
-      </w:r>
-    </w:p>
-    <w:p>
-      <w:pPr>
-        <w:pStyle w:val="ListParagraph"/>
-        <w:numPr>
-          <w:ilvl w:val="0"/>
-          <w:numId w:val="1"/>
-        </w:numPr>
-        <w:autoSpaceDE w:val="0"/>
-        <w:autoSpaceDN w:val="0"/>
-        <w:adjustRightInd w:val="0"/>
-        <w:spacing w:after="0" w:line="240" w:lineRule="auto"/>
-        <w:rPr>
-          <w:rFonts w:cstheme="minorHAnsi"/>
-        </w:rPr>
-      </w:pPr>
-      <w:r>
-        <w:rPr>
-          <w:rFonts w:cstheme="minorHAnsi"/>
-        </w:rPr>
-        <w:t>Never = 7</w:t>
-      </w:r>
-    </w:p>
-    <w:p>
-      <w:pPr>
-        <w:autoSpaceDE w:val="0"/>
-        <w:autoSpaceDN w:val="0"/>
-        <w:adjustRightInd w:val="0"/>
-        <w:spacing w:after="0" w:line="240" w:lineRule="auto"/>
-        <w:rPr>
-          <w:rFonts w:cstheme="minorHAnsi"/>
-        </w:rPr>
-      </w:pPr>
-    </w:p>
-    <w:p>
-      <w:pPr>
-        <w:spacing w:line="285" w:lineRule="atLeast"/>
-        <w:rPr>
-          <w:rFonts w:eastAsia="Times New Roman" w:cstheme="minorHAnsi"/>
-          <w:sz w:val="21"/>
-          <w:szCs w:val="21"/>
-          <w:u w:val="single"/>
-        </w:rPr>
-      </w:pPr>
-      <w:r>
-        <w:rPr>
-          <w:rFonts w:cstheme="minorHAnsi"/>
-          <w:u w:val="single"/>
-        </w:rPr>
-        <w:t>Own/Rent</w:t>
-      </w:r>
-      <w:r>
-        <w:rPr>
-          <w:rFonts w:cstheme="minorHAnsi"/>
-          <w:u w:val="single"/>
-        </w:rPr>
-        <w:t xml:space="preserve"> (</w:t>
-      </w:r>
-      <w:r>
-        <w:rPr>
-          <w:rFonts w:eastAsia="Times New Roman" w:cstheme="minorHAnsi"/>
-          <w:sz w:val="21"/>
-          <w:szCs w:val="21"/>
-          <w:u w:val="single"/>
-        </w:rPr>
-        <w:t>DWELOWN</w:t>
-      </w:r>
-      <w:r>
-        <w:rPr>
-          <w:rFonts w:eastAsia="Times New Roman" w:cstheme="minorHAnsi"/>
-          <w:sz w:val="21"/>
-          <w:szCs w:val="21"/>
-          <w:u w:val="single"/>
-        </w:rPr>
-        <w:t xml:space="preserve"> – page 321)</w:t>
-      </w:r>
-    </w:p>
-    <w:p>
-      <w:pPr>
-        <w:autoSpaceDE w:val="0"/>
-        <w:autoSpaceDN w:val="0"/>
-        <w:adjustRightInd w:val="0"/>
-        <w:spacing w:after="0" w:line="240" w:lineRule="auto"/>
-        <w:rPr>
-          <w:rFonts w:cstheme="minorHAnsi"/>
-        </w:rPr>
-      </w:pPr>
-      <w:r>
-        <w:rPr>
-          <w:rFonts w:cstheme="minorHAnsi"/>
-        </w:rPr>
-        <w:t>Label:</w:t>
-      </w:r>
-      <w:r>
-        <w:rPr>
-          <w:rFonts w:cstheme="minorHAnsi"/>
-        </w:rPr>
-        <w:t xml:space="preserve"> </w:t>
-      </w:r>
-      <w:r>
-        <w:rPr>
-          <w:rFonts w:cstheme="minorHAnsi"/>
-        </w:rPr>
-        <w:t>(Do you/Does your family) own your</w:t>
-      </w:r>
-      <w:r>
-        <w:rPr>
-          <w:rFonts w:cstheme="minorHAnsi"/>
-        </w:rPr>
-        <w:t xml:space="preserve"> </w:t>
-      </w:r>
-      <w:r>
-        <w:rPr>
-          <w:rFonts w:cstheme="minorHAnsi"/>
-        </w:rPr>
-        <w:t>(home/apartment), pay rent, or what?</w:t>
-      </w:r>
-    </w:p>
-    <w:p>
-      <w:pPr>
-        <w:autoSpaceDE w:val="0"/>
-        <w:autoSpaceDN w:val="0"/>
-        <w:adjustRightInd w:val="0"/>
-        <w:spacing w:after="0" w:line="240" w:lineRule="auto"/>
-        <w:rPr>
-          <w:rFonts w:cstheme="minorHAnsi"/>
-          <w:b/>
-          <w:bCs/>
-        </w:rPr>
-      </w:pPr>
-    </w:p>
-    <w:p>
-      <w:pPr>
-        <w:pStyle w:val="ListParagraph"/>
-        <w:numPr>
-          <w:ilvl w:val="0"/>
-          <w:numId w:val="1"/>
-        </w:numPr>
-        <w:autoSpaceDE w:val="0"/>
-        <w:autoSpaceDN w:val="0"/>
-        <w:adjustRightInd w:val="0"/>
-        <w:spacing w:after="0" w:line="240" w:lineRule="auto"/>
-        <w:rPr>
-          <w:rFonts w:cstheme="minorHAnsi"/>
-        </w:rPr>
-      </w:pPr>
-      <w:r>
-        <w:rPr>
-          <w:rFonts w:cstheme="minorHAnsi"/>
-        </w:rPr>
         <w:lastRenderedPageBreak/>
         <w:t>Own = 1</w:t>
       </w:r>
@@ -2139,6 +1860,141 @@
           <w:rFonts w:cstheme="minorHAnsi"/>
         </w:rPr>
       </w:pPr>
+    </w:p>
+    <w:p>
+      <w:pPr>
+        <w:autoSpaceDE w:val="0"/>
+        <w:autoSpaceDN w:val="0"/>
+        <w:adjustRightInd w:val="0"/>
+        <w:spacing w:after="0" w:line="240" w:lineRule="auto"/>
+        <w:rPr>
+          <w:rFonts w:cstheme="minorHAnsi"/>
+        </w:rPr>
+      </w:pPr>
+    </w:p>
+    <w:p>
+      <w:pPr>
+        <w:autoSpaceDE w:val="0"/>
+        <w:autoSpaceDN w:val="0"/>
+        <w:adjustRightInd w:val="0"/>
+        <w:spacing w:after="0" w:line="240" w:lineRule="auto"/>
+        <w:rPr>
+          <w:rFonts w:ascii="Times New Roman" w:hAnsi="Times New Roman" w:cs="Times New Roman"/>
+        </w:rPr>
+      </w:pPr>
+      <w:r>
+        <w:rPr>
+          <w:rFonts w:cstheme="minorHAnsi"/>
+        </w:rPr>
+        <w:t>Sexual Orientation (</w:t>
+      </w:r>
+      <w:r>
+        <w:rPr>
+          <w:rFonts w:ascii="Times New Roman" w:hAnsi="Times New Roman" w:cs="Times New Roman"/>
+        </w:rPr>
+        <w:t>SEXORNT</w:t>
+      </w:r>
+      <w:r>
+        <w:rPr>
+          <w:rFonts w:ascii="Times New Roman" w:hAnsi="Times New Roman" w:cs="Times New Roman"/>
+        </w:rPr>
+        <w:t xml:space="preserve"> – page 627)</w:t>
+      </w:r>
+    </w:p>
+    <w:p>
+      <w:pPr>
+        <w:autoSpaceDE w:val="0"/>
+        <w:autoSpaceDN w:val="0"/>
+        <w:adjustRightInd w:val="0"/>
+        <w:spacing w:after="0" w:line="240" w:lineRule="auto"/>
+        <w:rPr>
+          <w:rFonts w:ascii="Times New Roman" w:hAnsi="Times New Roman" w:cs="Times New Roman"/>
+        </w:rPr>
+      </w:pPr>
+      <w:r>
+        <w:rPr>
+          <w:rFonts w:ascii="Times New Roman" w:hAnsi="Times New Roman" w:cs="Times New Roman"/>
+        </w:rPr>
+        <w:t xml:space="preserve">Label: </w:t>
+      </w:r>
+      <w:r>
+        <w:rPr>
+          <w:rFonts w:ascii="Times New Roman" w:hAnsi="Times New Roman" w:cs="Times New Roman"/>
+        </w:rPr>
+        <w:t>Which of the following best describes you?</w:t>
+      </w:r>
+    </w:p>
+    <w:p>
+      <w:pPr>
+        <w:pStyle w:val="ListParagraph"/>
+        <w:numPr>
+          <w:ilvl w:val="0"/>
+          <w:numId w:val="1"/>
+        </w:numPr>
+        <w:autoSpaceDE w:val="0"/>
+        <w:autoSpaceDN w:val="0"/>
+        <w:adjustRightInd w:val="0"/>
+        <w:spacing w:after="0" w:line="240" w:lineRule="auto"/>
+        <w:rPr>
+          <w:rFonts w:ascii="Times New Roman" w:hAnsi="Times New Roman" w:cs="Times New Roman"/>
+        </w:rPr>
+      </w:pPr>
+      <w:r>
+        <w:rPr>
+          <w:rFonts w:ascii="Times New Roman" w:hAnsi="Times New Roman" w:cs="Times New Roman"/>
+        </w:rPr>
+        <w:t>Gay, lesbian, or homosexual</w:t>
+      </w:r>
+      <w:r>
+        <w:rPr>
+          <w:rFonts w:ascii="Times New Roman" w:hAnsi="Times New Roman" w:cs="Times New Roman"/>
+        </w:rPr>
+        <w:t xml:space="preserve"> = 1</w:t>
+      </w:r>
+    </w:p>
+    <w:p>
+      <w:pPr>
+        <w:pStyle w:val="ListParagraph"/>
+        <w:numPr>
+          <w:ilvl w:val="0"/>
+          <w:numId w:val="1"/>
+        </w:numPr>
+        <w:autoSpaceDE w:val="0"/>
+        <w:autoSpaceDN w:val="0"/>
+        <w:adjustRightInd w:val="0"/>
+        <w:spacing w:after="0" w:line="240" w:lineRule="auto"/>
+        <w:rPr>
+          <w:rFonts w:ascii="Times New Roman" w:hAnsi="Times New Roman" w:cs="Times New Roman"/>
+        </w:rPr>
+      </w:pPr>
+      <w:r>
+        <w:rPr>
+          <w:rFonts w:ascii="Times New Roman" w:hAnsi="Times New Roman" w:cs="Times New Roman"/>
+        </w:rPr>
+        <w:t>Bisexual = 2</w:t>
+      </w:r>
+    </w:p>
+    <w:p>
+      <w:pPr>
+        <w:pStyle w:val="ListParagraph"/>
+        <w:numPr>
+          <w:ilvl w:val="0"/>
+          <w:numId w:val="1"/>
+        </w:numPr>
+        <w:autoSpaceDE w:val="0"/>
+        <w:autoSpaceDN w:val="0"/>
+        <w:adjustRightInd w:val="0"/>
+        <w:spacing w:after="0" w:line="240" w:lineRule="auto"/>
+        <w:rPr>
+          <w:rFonts w:ascii="Times New Roman" w:hAnsi="Times New Roman" w:cs="Times New Roman"/>
+        </w:rPr>
+      </w:pPr>
+      <w:r>
+        <w:rPr>
+          <w:rFonts w:ascii="Times New Roman" w:hAnsi="Times New Roman" w:cs="Times New Roman"/>
+        </w:rPr>
+        <w:t>Heterosexual or straight = 3</w:t>
+      </w:r>
     </w:p>
     <w:p>
       <w:pPr>

</xml_diff>